<commit_message>
vault backup: 2026-09-07 01:12:06
</commit_message>
<xml_diff>
--- a/Investigare/pg/ANTEPRIMA_Fujita_Emi.docx
+++ b/Investigare/pg/ANTEPRIMA_Fujita_Emi.docx
@@ -2427,7 +2427,7 @@
           <w:color w:val="787878"/>
           <w:sz w:val="18"/>
         </w:rPr>
-        <w:t>• Armadietto — Revolver New Nambu M60 (.38, 5 colpi): Lucidità · vel. 3/1 · ricarica 4 · danno 3. Addestramento base: sai usarla, non sei una tiratrice scelta</w:t>
+        <w:t>• Armadietto — Revolver New Nambu M60 (.38, 5 colpi): Lucidità · vel. 4/2 · ricarica 5 · danno 4. Addestramento base: sai usarla, non sei una tiratrice scelta</w:t>
       </w:r>
     </w:p>
     <w:p>
@@ -2461,7 +2461,7 @@
           <w:color w:val="787878"/>
           <w:sz w:val="18"/>
         </w:rPr>
-        <w:t>• Operazioni — Keibō (manganello): Silenzio · vel. 2/1 · danno 2</w:t>
+        <w:t>• Operazioni — Keibō (manganello): Silenzio · vel. 2/2 · danno 2</w:t>
       </w:r>
     </w:p>
     <w:p>

</xml_diff>